<commit_message>
update v simulaci, doplnění experimentální část v Texu
</commit_message>
<xml_diff>
--- a/DP_text.docx
+++ b/DP_text.docx
@@ -6853,6 +6853,20 @@
               <w:t>M_coeff</w:t>
             </w:r>
             <w:proofErr w:type="spellEnd"/>
+            <w:r>
+              <w:t xml:space="preserve"> </w:t>
+            </w:r>
+            <w:r>
+              <w:t>[</w:t>
+            </w:r>
+            <w:proofErr w:type="spellStart"/>
+            <w:r>
+              <w:t>M_dot</w:t>
+            </w:r>
+            <w:proofErr w:type="spellEnd"/>
+            <w:r>
+              <w:t>]</w:t>
+            </w:r>
           </w:p>
         </w:tc>
         <w:tc>
@@ -6862,6 +6876,20 @@
           <w:p>
             <w:r>
               <w:t>M_NS</w:t>
+            </w:r>
+            <w:r>
+              <w:t xml:space="preserve"> </w:t>
+            </w:r>
+            <w:r>
+              <w:t>[</w:t>
+            </w:r>
+            <w:proofErr w:type="spellStart"/>
+            <w:r>
+              <w:t>M_dot</w:t>
+            </w:r>
+            <w:proofErr w:type="spellEnd"/>
+            <w:r>
+              <w:t>]</w:t>
             </w:r>
           </w:p>
         </w:tc>
@@ -7236,10 +7264,6 @@
     </w:tbl>
     <w:p>
       <w:r>
-        <w:br w:type="page"/>
-      </w:r>
-      <w:r>
-        <w:lastRenderedPageBreak/>
         <w:t>Tabulka ke grafu 01</w:t>
       </w:r>
     </w:p>
@@ -7280,6 +7304,17 @@
               <w:t>M_coeff</w:t>
             </w:r>
             <w:proofErr w:type="spellEnd"/>
+            <w:r>
+              <w:t xml:space="preserve"> [</w:t>
+            </w:r>
+            <w:proofErr w:type="spellStart"/>
+            <w:r>
+              <w:t>M_dot</w:t>
+            </w:r>
+            <w:proofErr w:type="spellEnd"/>
+            <w:r>
+              <w:t>]</w:t>
+            </w:r>
           </w:p>
         </w:tc>
         <w:tc>
@@ -7289,6 +7324,20 @@
           <w:p>
             <w:r>
               <w:t>M_NS</w:t>
+            </w:r>
+            <w:r>
+              <w:t xml:space="preserve"> </w:t>
+            </w:r>
+            <w:r>
+              <w:t>[</w:t>
+            </w:r>
+            <w:proofErr w:type="spellStart"/>
+            <w:r>
+              <w:t>M_dot</w:t>
+            </w:r>
+            <w:proofErr w:type="spellEnd"/>
+            <w:r>
+              <w:t>]</w:t>
             </w:r>
           </w:p>
         </w:tc>
@@ -7688,10 +7737,75 @@
         </w:tc>
       </w:tr>
     </w:tbl>
+    <w:p>
+      <w:r>
+        <w:t>Tabulka ke grafu 02</w:t>
+      </w:r>
+    </w:p>
     <w:p/>
     <w:p/>
     <w:p>
       <w:r>
+        <w:t>26.3.</w:t>
+      </w:r>
+      <w:r>
+        <w:br/>
+        <w:t xml:space="preserve">Úkol: najít maxima v grafech, okomentovat experiment, co se děje, když se zvyšuje hmotnost a co když se zvyšuje poloměr, co to může znamenat, upravit grafy, nepsat tam </w:t>
+      </w:r>
+      <w:proofErr w:type="spellStart"/>
+      <w:r>
+        <w:t>m_coeff</w:t>
+      </w:r>
+      <w:proofErr w:type="spellEnd"/>
+      <w:r>
+        <w:t>, ale co to reálně znamená a tak</w:t>
+      </w:r>
+    </w:p>
+    <w:p/>
+    <w:p>
+      <w:r>
+        <w:t>Parametry z kódu:</w:t>
+      </w:r>
+      <w:r>
+        <w:br/>
+      </w:r>
+      <w:proofErr w:type="spellStart"/>
+      <w:r>
+        <w:t>R_cci</w:t>
+      </w:r>
+      <w:proofErr w:type="spellEnd"/>
+      <w:r>
+        <w:tab/>
+      </w:r>
+      <w:proofErr w:type="spellStart"/>
+      <w:r>
+        <w:t>Radius</w:t>
+      </w:r>
+      <w:proofErr w:type="spellEnd"/>
+      <w:r>
+        <w:t xml:space="preserve"> </w:t>
+      </w:r>
+      <w:proofErr w:type="spellStart"/>
+      <w:r>
+        <w:t>of</w:t>
+      </w:r>
+      <w:proofErr w:type="spellEnd"/>
+      <w:r>
+        <w:t xml:space="preserve"> </w:t>
+      </w:r>
+      <w:proofErr w:type="spellStart"/>
+      <w:r>
+        <w:t>crust-core</w:t>
+      </w:r>
+      <w:proofErr w:type="spellEnd"/>
+      <w:r>
+        <w:t xml:space="preserve"> interface. Fyzikální poloměr, kde končí neutronové jádro a začíná vnitřní kůra hvězdy</w:t>
+      </w:r>
+    </w:p>
+    <w:p/>
+    <w:p/>
+    <w:p>
+      <w:r>
         <w:rPr>
           <w:sz w:val="40"/>
           <w:szCs w:val="40"/>
@@ -7892,6 +8006,7 @@
         <w:pStyle w:val="Normlnweb"/>
       </w:pPr>
       <w:r>
+        <w:lastRenderedPageBreak/>
         <w:t xml:space="preserve">První zmínky o neutronových hvězdách sahají do 30. let 20. století. Po objevu neutronu </w:t>
       </w:r>
       <w:proofErr w:type="spellStart"/>
@@ -7978,7 +8093,6 @@
         <w:pStyle w:val="Normlnweb"/>
       </w:pPr>
       <w:r>
-        <w:lastRenderedPageBreak/>
         <w:t xml:space="preserve">K rozhodujícímu průlomovému momentu došlo v roce 1967, kdy byly objeveny první </w:t>
       </w:r>
       <w:proofErr w:type="spellStart"/>
@@ -8172,6 +8286,9 @@
       </w:r>
       <w:r>
         <w:br/>
+      </w:r>
+      <w:r>
+        <w:lastRenderedPageBreak/>
         <w:t>V základním modelu čistého magnetického dipólového záření má brzdný index hodnotu n=3. Tato hodn</w:t>
       </w:r>
       <w:r>
@@ -8358,7 +8475,6 @@
     </w:p>
     <w:p>
       <w:r>
-        <w:lastRenderedPageBreak/>
         <w:t>Tedy</w:t>
       </w:r>
     </w:p>
@@ -8814,6 +8930,7 @@
     </w:p>
     <w:p>
       <w:r>
+        <w:lastRenderedPageBreak/>
         <w:t>Dosazením do vzorce pro brzdný index potom</w:t>
       </w:r>
       <w:r>
@@ -8935,7 +9052,6 @@
         <w:rPr>
           <w:noProof/>
         </w:rPr>
-        <w:lastRenderedPageBreak/>
         <w:drawing>
           <wp:inline distT="0" distB="0" distL="0" distR="0">
             <wp:extent cx="4178300" cy="1257300"/>
@@ -9295,7 +9411,6 @@
         </w:rPr>
       </w:pPr>
       <w:r>
-        <w:lastRenderedPageBreak/>
         <w:t xml:space="preserve">Tato složka představuje jadernou mřížku a pevně spojenou nabitou konglomeraci v jádře, které rotují rigidně. Představuje tu část hvězdy, která je přímo pozorovatelná a jejíž frekvence </w:t>
       </w:r>
       <w:proofErr w:type="spellStart"/>
@@ -9663,7 +9778,11 @@
         <w:pStyle w:val="Normlnweb"/>
       </w:pPr>
       <w:r>
-        <w:t>Dynamika supertekutiny, která je důsledkem hustotně závislého tření, způsobuje, že se moment hybnosti přenáší do různých částí kůry a jádra v různých časových měřítkách. To může vést k tomu, že se změna frekvence rotace stane v čase nemonotónní, což umožňuje dosažení maximální hodnoty mnohem větší, než je naměřená velikost glitche, a také zpoždění v regeneraci</w:t>
+        <w:t xml:space="preserve">Dynamika supertekutiny, která je důsledkem hustotně závislého tření, způsobuje, že se moment hybnosti přenáší do různých částí kůry a jádra v různých časových měřítkách. To </w:t>
+      </w:r>
+      <w:r>
+        <w:lastRenderedPageBreak/>
+        <w:t>může vést k tomu, že se změna frekvence rotace stane v čase nemonotónní, což umožňuje dosažení maximální hodnoty mnohem větší, než je naměřená velikost glitche, a také zpoždění v regeneraci</w:t>
       </w:r>
     </w:p>
     <w:p>

</xml_diff>